<commit_message>
feat: save formatka row on Word generate and unbold filled fields
POST to Apps Script Web App before downloading .docx; split template
runs so user values are not bold while labels stay emphasized.

Co-authored-by: Cursor <cursoragent@cursor.com>
</commit_message>
<xml_diff>
--- a/docs/pusty.docx
+++ b/docs/pusty.docx
@@ -15,7 +15,11 @@
           <w:b/>
           <w:bCs/>
         </w:rPr>
-        <w:t xml:space="preserve">Zlecenie transportowe nr: {{numer_zlecenia_transportowego}}</w:t>
+        <w:t xml:space="preserve">Zlecenie transportowe nr: </w:t>
+      </w:r>
+      <w:r>
+        <w:rPr/>
+        <w:t>{{numer_zlecenia_transportowego}}</w:t>
       </w:r>
     </w:p>
     <w:p>
@@ -28,7 +32,11 @@
           <w:b/>
           <w:bCs/>
         </w:rPr>
-        <w:t xml:space="preserve">Miejsce załadunku: {{miejsce_zaladunku}}</w:t>
+        <w:t xml:space="preserve">Miejsce załadunku: </w:t>
+      </w:r>
+      <w:r>
+        <w:rPr/>
+        <w:t>{{miejsce_zaladunku}}</w:t>
       </w:r>
     </w:p>
     <w:p>
@@ -41,7 +49,11 @@
           <w:b/>
           <w:bCs/>
         </w:rPr>
-        <w:t xml:space="preserve">Przewoźnik: {{przewoznik}}</w:t>
+        <w:t xml:space="preserve">Przewoźnik: </w:t>
+      </w:r>
+      <w:r>
+        <w:rPr/>
+        <w:t>{{przewoznik}}</w:t>
       </w:r>
     </w:p>
     <w:p>
@@ -54,7 +66,11 @@
           <w:b/>
           <w:bCs/>
         </w:rPr>
-        <w:t xml:space="preserve">Miejsce dostawy: {{miejsce_dostawy}}</w:t>
+        <w:t xml:space="preserve">Miejsce dostawy: </w:t>
+      </w:r>
+      <w:r>
+        <w:rPr/>
+        <w:t>{{miejsce_dostawy}}</w:t>
       </w:r>
     </w:p>
     <w:p>
@@ -70,7 +86,11 @@
           <w:b/>
           <w:bCs/>
         </w:rPr>
-        <w:t xml:space="preserve">Dane do awizacji: {{dane_do_awizacji}}</w:t>
+        <w:t xml:space="preserve">Dane do awizacji: </w:t>
+      </w:r>
+      <w:r>
+        <w:rPr/>
+        <w:t>{{dane_do_awizacji}}</w:t>
       </w:r>
     </w:p>
     <w:p>
@@ -120,7 +140,11 @@
           <w:b/>
           <w:bCs/>
         </w:rPr>
-        <w:t xml:space="preserve">Data załadunku: {{data_zaladunku}}</w:t>
+        <w:t xml:space="preserve">Data załadunku: </w:t>
+      </w:r>
+      <w:r>
+        <w:rPr/>
+        <w:t>{{data_zaladunku}}</w:t>
       </w:r>
     </w:p>
     <w:p>

</xml_diff>